<commit_message>
fix: criação automatica das tabelas na api C# e correção da documentação do projeto
</commit_message>
<xml_diff>
--- a/documentacao devops.docx
+++ b/documentacao devops.docx
@@ -1,6 +1,6 @@
 
 <file path=word/document.xml><?xml version="1.0" encoding="utf-8"?>
-<w:document xmlns:wpc="http://schemas.microsoft.com/office/word/2010/wordprocessingCanvas" xmlns:cx="http://schemas.microsoft.com/office/drawing/2014/chartex" xmlns:cx1="http://schemas.microsoft.com/office/drawing/2015/9/8/chartex" xmlns:cx2="http://schemas.microsoft.com/office/drawing/2015/10/21/chartex" xmlns:cx3="http://schemas.microsoft.com/office/drawing/2016/5/9/chartex" xmlns:cx4="http://schemas.microsoft.com/office/drawing/2016/5/10/chartex" xmlns:cx5="http://schemas.microsoft.com/office/drawing/2016/5/11/chartex" xmlns:cx6="http://schemas.microsoft.com/office/drawing/2016/5/12/chartex" xmlns:cx7="http://schemas.microsoft.com/office/drawing/2016/5/13/chartex" xmlns:cx8="http://schemas.microsoft.com/office/drawing/2016/5/14/chartex" xmlns:mc="http://schemas.openxmlformats.org/markup-compatibility/2006" xmlns:aink="http://schemas.microsoft.com/office/drawing/2016/ink" xmlns:am3d="http://schemas.microsoft.com/office/drawing/2017/model3d" xmlns:o="urn:schemas-microsoft-com:office:office" xmlns:r="http://schemas.openxmlformats.org/officeDocument/2006/relationships" xmlns:m="http://schemas.openxmlformats.org/officeDocument/2006/math" xmlns:v="urn:schemas-microsoft-com:vml" xmlns:wp14="http://schemas.microsoft.com/office/word/2010/wordprocessingDrawing" xmlns:wp="http://schemas.openxmlformats.org/drawingml/2006/wordprocessingDrawing" xmlns:w10="urn:schemas-microsoft-com:office:word" xmlns:w="http://schemas.openxmlformats.org/wordprocessingml/2006/main" xmlns:w14="http://schemas.microsoft.com/office/word/2010/wordml" xmlns:w15="http://schemas.microsoft.com/office/word/2012/wordml" xmlns:w16cex="http://schemas.microsoft.com/office/word/2018/wordml/cex" xmlns:w16cid="http://schemas.microsoft.com/office/word/2016/wordml/cid" xmlns:w16="http://schemas.microsoft.com/office/word/2018/wordml" xmlns:w16sdtdh="http://schemas.microsoft.com/office/word/2020/wordml/sdtdatahash" xmlns:w16se="http://schemas.microsoft.com/office/word/2015/wordml/symex" xmlns:wpg="http://schemas.microsoft.com/office/word/2010/wordprocessingGroup" xmlns:wpi="http://schemas.microsoft.com/office/word/2010/wordprocessingInk" xmlns:wne="http://schemas.microsoft.com/office/word/2006/wordml" xmlns:wps="http://schemas.microsoft.com/office/word/2010/wordprocessingShape" mc:Ignorable="w14 w15 w16se w16cid w16 w16cex w16sdtdh wp14">
+<w:document xmlns:wpc="http://schemas.microsoft.com/office/word/2010/wordprocessingCanvas" xmlns:cx="http://schemas.microsoft.com/office/drawing/2014/chartex" xmlns:cx1="http://schemas.microsoft.com/office/drawing/2015/9/8/chartex" xmlns:cx2="http://schemas.microsoft.com/office/drawing/2015/10/21/chartex" xmlns:cx3="http://schemas.microsoft.com/office/drawing/2016/5/9/chartex" xmlns:cx4="http://schemas.microsoft.com/office/drawing/2016/5/10/chartex" xmlns:cx5="http://schemas.microsoft.com/office/drawing/2016/5/11/chartex" xmlns:cx6="http://schemas.microsoft.com/office/drawing/2016/5/12/chartex" xmlns:cx7="http://schemas.microsoft.com/office/drawing/2016/5/13/chartex" xmlns:cx8="http://schemas.microsoft.com/office/drawing/2016/5/14/chartex" xmlns:mc="http://schemas.openxmlformats.org/markup-compatibility/2006" xmlns:aink="http://schemas.microsoft.com/office/drawing/2016/ink" xmlns:am3d="http://schemas.microsoft.com/office/drawing/2017/model3d" xmlns:o="urn:schemas-microsoft-com:office:office" xmlns:oel="http://schemas.microsoft.com/office/2019/extlst" xmlns:r="http://schemas.openxmlformats.org/officeDocument/2006/relationships" xmlns:m="http://schemas.openxmlformats.org/officeDocument/2006/math" xmlns:v="urn:schemas-microsoft-com:vml" xmlns:wp14="http://schemas.microsoft.com/office/word/2010/wordprocessingDrawing" xmlns:wp="http://schemas.openxmlformats.org/drawingml/2006/wordprocessingDrawing" xmlns:w10="urn:schemas-microsoft-com:office:word" xmlns:w="http://schemas.openxmlformats.org/wordprocessingml/2006/main" xmlns:w14="http://schemas.microsoft.com/office/word/2010/wordml" xmlns:w15="http://schemas.microsoft.com/office/word/2012/wordml" xmlns:w16cex="http://schemas.microsoft.com/office/word/2018/wordml/cex" xmlns:w16cid="http://schemas.microsoft.com/office/word/2016/wordml/cid" xmlns:w16="http://schemas.microsoft.com/office/word/2018/wordml" xmlns:w16du="http://schemas.microsoft.com/office/word/2023/wordml/word16du" xmlns:w16sdtdh="http://schemas.microsoft.com/office/word/2020/wordml/sdtdatahash" xmlns:w16sdtfl="http://schemas.microsoft.com/office/word/2024/wordml/sdtformatlock" xmlns:w16se="http://schemas.microsoft.com/office/word/2015/wordml/symex" xmlns:wpg="http://schemas.microsoft.com/office/word/2010/wordprocessingGroup" xmlns:wpi="http://schemas.microsoft.com/office/word/2010/wordprocessingInk" xmlns:wne="http://schemas.microsoft.com/office/word/2006/wordml" xmlns:wps="http://schemas.microsoft.com/office/word/2010/wordprocessingShape" mc:Ignorable="w14 w15 w16se w16cid w16 w16cex w16sdtdh w16sdtfl w16du wp14">
   <w:body>
     <w:p>
       <w:pPr>
@@ -11,6 +11,7 @@
           <w:bCs/>
           <w:sz w:val="32"/>
           <w:szCs w:val="32"/>
+          <w:lang w:val="en-US"/>
         </w:rPr>
       </w:pPr>
       <w:r>
@@ -20,6 +21,7 @@
           <w:bCs/>
           <w:sz w:val="32"/>
           <w:szCs w:val="32"/>
+          <w:lang w:val="en-US"/>
         </w:rPr>
         <w:t>FIAP CHALLENGE 2026 – 2TDSPJ</w:t>
       </w:r>
@@ -31,6 +33,7 @@
           <w:rFonts w:ascii="Arial" w:hAnsi="Arial" w:cs="Arial"/>
           <w:sz w:val="24"/>
           <w:szCs w:val="24"/>
+          <w:lang w:val="en-US"/>
         </w:rPr>
       </w:pPr>
     </w:p>
@@ -41,13 +44,15 @@
           <w:rFonts w:ascii="Arial" w:hAnsi="Arial" w:cs="Arial"/>
           <w:sz w:val="28"/>
           <w:szCs w:val="28"/>
-        </w:rPr>
-      </w:pPr>
-      <w:r>
-        <w:rPr>
-          <w:rFonts w:ascii="Arial" w:hAnsi="Arial" w:cs="Arial"/>
-          <w:sz w:val="28"/>
-          <w:szCs w:val="28"/>
+          <w:lang w:val="en-US"/>
+        </w:rPr>
+      </w:pPr>
+      <w:r>
+        <w:rPr>
+          <w:rFonts w:ascii="Arial" w:hAnsi="Arial" w:cs="Arial"/>
+          <w:sz w:val="28"/>
+          <w:szCs w:val="28"/>
+          <w:lang w:val="en-US"/>
         </w:rPr>
         <w:t>DevOps and Cloud Computing</w:t>
       </w:r>
@@ -59,6 +64,7 @@
           <w:rFonts w:ascii="Arial" w:hAnsi="Arial" w:cs="Arial"/>
           <w:sz w:val="24"/>
           <w:szCs w:val="24"/>
+          <w:lang w:val="en-US"/>
         </w:rPr>
       </w:pPr>
     </w:p>
@@ -115,106 +121,119 @@
           <w:sz w:val="24"/>
           <w:szCs w:val="24"/>
         </w:rPr>
-        <w:t>Equipe DrivenSoft</w:t>
-      </w:r>
-    </w:p>
-    <w:p>
-      <w:pPr>
-        <w:rPr>
-          <w:rFonts w:ascii="Arial" w:hAnsi="Arial" w:cs="Arial"/>
-          <w:sz w:val="24"/>
-          <w:szCs w:val="24"/>
-        </w:rPr>
-      </w:pPr>
-    </w:p>
-    <w:p>
-      <w:pPr>
-        <w:rPr>
-          <w:rFonts w:ascii="Arial" w:hAnsi="Arial" w:cs="Arial"/>
-          <w:sz w:val="24"/>
-          <w:szCs w:val="24"/>
-        </w:rPr>
-      </w:pPr>
-      <w:r>
-        <w:rPr>
-          <w:rFonts w:ascii="Arial" w:hAnsi="Arial" w:cs="Arial"/>
-          <w:sz w:val="24"/>
-          <w:szCs w:val="24"/>
-        </w:rPr>
-        <w:t>- RM563717 Max Hayashi Batista</w:t>
-      </w:r>
-    </w:p>
-    <w:p>
-      <w:pPr>
-        <w:rPr>
-          <w:rFonts w:ascii="Arial" w:hAnsi="Arial" w:cs="Arial"/>
-          <w:sz w:val="24"/>
-          <w:szCs w:val="24"/>
-        </w:rPr>
-      </w:pPr>
-      <w:r>
-        <w:rPr>
-          <w:rFonts w:ascii="Arial" w:hAnsi="Arial" w:cs="Arial"/>
-          <w:sz w:val="24"/>
-          <w:szCs w:val="24"/>
-        </w:rPr>
-        <w:t>- RM565119 Henrique Cunha Torres</w:t>
-      </w:r>
-    </w:p>
-    <w:p>
-      <w:pPr>
-        <w:rPr>
-          <w:rFonts w:ascii="Arial" w:hAnsi="Arial" w:cs="Arial"/>
-          <w:sz w:val="24"/>
-          <w:szCs w:val="24"/>
-        </w:rPr>
-      </w:pPr>
-      <w:r>
-        <w:rPr>
-          <w:rFonts w:ascii="Arial" w:hAnsi="Arial" w:cs="Arial"/>
-          <w:sz w:val="24"/>
-          <w:szCs w:val="24"/>
-        </w:rPr>
-        <w:t>- RM564723 Felipe Bezerra Beatrici</w:t>
-      </w:r>
-    </w:p>
-    <w:p>
-      <w:pPr>
-        <w:rPr>
-          <w:rFonts w:ascii="Arial" w:hAnsi="Arial" w:cs="Arial"/>
-          <w:sz w:val="24"/>
-          <w:szCs w:val="24"/>
-        </w:rPr>
-      </w:pPr>
-      <w:r>
-        <w:rPr>
-          <w:rFonts w:ascii="Arial" w:hAnsi="Arial" w:cs="Arial"/>
-          <w:sz w:val="24"/>
-          <w:szCs w:val="24"/>
-        </w:rPr>
-        <w:t>-------------------------------------------------</w:t>
-      </w:r>
-    </w:p>
-    <w:p>
-      <w:pPr>
-        <w:rPr>
-          <w:rFonts w:ascii="Arial" w:hAnsi="Arial" w:cs="Arial"/>
-          <w:sz w:val="24"/>
-          <w:szCs w:val="24"/>
-        </w:rPr>
-      </w:pPr>
-    </w:p>
-    <w:p>
-      <w:pPr>
+        <w:t xml:space="preserve">Equipe </w:t>
+      </w:r>
+      <w:proofErr w:type="spellStart"/>
+      <w:r>
         <w:rPr>
           <w:rFonts w:ascii="Arial" w:hAnsi="Arial" w:cs="Arial"/>
           <w:b/>
           <w:bCs/>
-          <w:sz w:val="28"/>
-          <w:szCs w:val="28"/>
-        </w:rPr>
-      </w:pPr>
-      <w:r>
+          <w:sz w:val="24"/>
+          <w:szCs w:val="24"/>
+        </w:rPr>
+        <w:t>DrivenSoft</w:t>
+      </w:r>
+      <w:proofErr w:type="spellEnd"/>
+    </w:p>
+    <w:p>
+      <w:pPr>
+        <w:rPr>
+          <w:rFonts w:ascii="Arial" w:hAnsi="Arial" w:cs="Arial"/>
+          <w:sz w:val="24"/>
+          <w:szCs w:val="24"/>
+        </w:rPr>
+      </w:pPr>
+    </w:p>
+    <w:p>
+      <w:pPr>
+        <w:rPr>
+          <w:rFonts w:ascii="Arial" w:hAnsi="Arial" w:cs="Arial"/>
+          <w:sz w:val="24"/>
+          <w:szCs w:val="24"/>
+        </w:rPr>
+      </w:pPr>
+      <w:r>
+        <w:rPr>
+          <w:rFonts w:ascii="Arial" w:hAnsi="Arial" w:cs="Arial"/>
+          <w:sz w:val="24"/>
+          <w:szCs w:val="24"/>
+        </w:rPr>
+        <w:t>- RM563717 Max Hayashi Batista</w:t>
+      </w:r>
+    </w:p>
+    <w:p>
+      <w:pPr>
+        <w:rPr>
+          <w:rFonts w:ascii="Arial" w:hAnsi="Arial" w:cs="Arial"/>
+          <w:sz w:val="24"/>
+          <w:szCs w:val="24"/>
+        </w:rPr>
+      </w:pPr>
+      <w:r>
+        <w:rPr>
+          <w:rFonts w:ascii="Arial" w:hAnsi="Arial" w:cs="Arial"/>
+          <w:sz w:val="24"/>
+          <w:szCs w:val="24"/>
+        </w:rPr>
+        <w:t>- RM565119 Henrique Cunha Torres</w:t>
+      </w:r>
+    </w:p>
+    <w:p>
+      <w:pPr>
+        <w:rPr>
+          <w:rFonts w:ascii="Arial" w:hAnsi="Arial" w:cs="Arial"/>
+          <w:sz w:val="24"/>
+          <w:szCs w:val="24"/>
+        </w:rPr>
+      </w:pPr>
+      <w:r>
+        <w:rPr>
+          <w:rFonts w:ascii="Arial" w:hAnsi="Arial" w:cs="Arial"/>
+          <w:sz w:val="24"/>
+          <w:szCs w:val="24"/>
+        </w:rPr>
+        <w:t xml:space="preserve">- RM564723 Felipe Bezerra </w:t>
+      </w:r>
+      <w:proofErr w:type="spellStart"/>
+      <w:r>
+        <w:rPr>
+          <w:rFonts w:ascii="Arial" w:hAnsi="Arial" w:cs="Arial"/>
+          <w:sz w:val="24"/>
+          <w:szCs w:val="24"/>
+        </w:rPr>
+        <w:t>Beatrici</w:t>
+      </w:r>
+      <w:proofErr w:type="spellEnd"/>
+    </w:p>
+    <w:p>
+      <w:pPr>
+        <w:rPr>
+          <w:rFonts w:ascii="Arial" w:hAnsi="Arial" w:cs="Arial"/>
+          <w:sz w:val="24"/>
+          <w:szCs w:val="24"/>
+        </w:rPr>
+      </w:pPr>
+      <w:r>
+        <w:rPr>
+          <w:rFonts w:ascii="Arial" w:hAnsi="Arial" w:cs="Arial"/>
+          <w:sz w:val="24"/>
+          <w:szCs w:val="24"/>
+        </w:rPr>
+        <w:t>-------------------------------------------------</w:t>
+      </w:r>
+    </w:p>
+    <w:p>
+      <w:pPr>
+        <w:rPr>
+          <w:rFonts w:ascii="Arial" w:hAnsi="Arial" w:cs="Arial"/>
+          <w:sz w:val="24"/>
+          <w:szCs w:val="24"/>
+        </w:rPr>
+      </w:pPr>
+    </w:p>
+    <w:p>
+      <w:pPr>
         <w:rPr>
           <w:rFonts w:ascii="Arial" w:hAnsi="Arial" w:cs="Arial"/>
           <w:b/>
@@ -222,6 +241,15 @@
           <w:sz w:val="28"/>
           <w:szCs w:val="28"/>
         </w:rPr>
+      </w:pPr>
+      <w:r>
+        <w:rPr>
+          <w:rFonts w:ascii="Arial" w:hAnsi="Arial" w:cs="Arial"/>
+          <w:b/>
+          <w:bCs/>
+          <w:sz w:val="28"/>
+          <w:szCs w:val="28"/>
+        </w:rPr>
         <w:t>Índice</w:t>
       </w:r>
     </w:p>
@@ -282,7 +310,48 @@
           <w:sz w:val="24"/>
           <w:szCs w:val="24"/>
         </w:rPr>
-        <w:t>Link do repositório GitHub ................................................................................. 3</w:t>
+        <w:t>Arquitetura da solução</w:t>
+      </w:r>
+      <w:r>
+        <w:rPr>
+          <w:rFonts w:ascii="Arial" w:hAnsi="Arial" w:cs="Arial"/>
+          <w:sz w:val="24"/>
+          <w:szCs w:val="24"/>
+        </w:rPr>
+        <w:t xml:space="preserve"> </w:t>
+      </w:r>
+      <w:r>
+        <w:rPr>
+          <w:rFonts w:ascii="Arial" w:hAnsi="Arial" w:cs="Arial"/>
+          <w:sz w:val="24"/>
+          <w:szCs w:val="24"/>
+        </w:rPr>
+        <w:t>......</w:t>
+      </w:r>
+      <w:r>
+        <w:rPr>
+          <w:rFonts w:ascii="Arial" w:hAnsi="Arial" w:cs="Arial"/>
+          <w:sz w:val="24"/>
+          <w:szCs w:val="24"/>
+        </w:rPr>
+        <w:t>................................................................................. 3</w:t>
+      </w:r>
+    </w:p>
+    <w:p>
+      <w:pPr>
+        <w:rPr>
+          <w:rFonts w:ascii="Arial" w:hAnsi="Arial" w:cs="Arial"/>
+          <w:sz w:val="24"/>
+          <w:szCs w:val="24"/>
+        </w:rPr>
+      </w:pPr>
+      <w:r>
+        <w:rPr>
+          <w:rFonts w:ascii="Arial" w:hAnsi="Arial" w:cs="Arial"/>
+          <w:sz w:val="24"/>
+          <w:szCs w:val="24"/>
+        </w:rPr>
+        <w:t>Link do repositório GitHub ................................................................................. 4</w:t>
       </w:r>
     </w:p>
     <w:p>
@@ -437,7 +506,6 @@
           <w:sz w:val="36"/>
           <w:szCs w:val="36"/>
         </w:rPr>
-        <w:lastRenderedPageBreak/>
         <w:t>Arquitetura da Solução</w:t>
       </w:r>
     </w:p>
@@ -486,13 +554,15 @@
       </w:pPr>
       <w:r>
         <w:rPr>
-          <w:noProof/>
+          <w:rFonts w:ascii="Arial" w:hAnsi="Arial" w:cs="Arial"/>
+          <w:sz w:val="28"/>
+          <w:szCs w:val="28"/>
         </w:rPr>
         <w:drawing>
-          <wp:inline distT="0" distB="0" distL="0" distR="0" wp14:anchorId="18E90453" wp14:editId="596B93E7">
-            <wp:extent cx="5400040" cy="3196590"/>
-            <wp:effectExtent l="0" t="0" r="0" b="3810"/>
-            <wp:docPr id="1" name="Imagem 1"/>
+          <wp:inline distT="0" distB="0" distL="0" distR="0" wp14:anchorId="66A34B8D" wp14:editId="647E47A5">
+            <wp:extent cx="5400040" cy="3004820"/>
+            <wp:effectExtent l="0" t="0" r="0" b="5080"/>
+            <wp:docPr id="1198291540" name="Imagem 1"/>
             <wp:cNvGraphicFramePr>
               <a:graphicFrameLocks xmlns:a="http://schemas.openxmlformats.org/drawingml/2006/main" noChangeAspect="1"/>
             </wp:cNvGraphicFramePr>
@@ -500,7 +570,7 @@
               <a:graphicData uri="http://schemas.openxmlformats.org/drawingml/2006/picture">
                 <pic:pic xmlns:pic="http://schemas.openxmlformats.org/drawingml/2006/picture">
                   <pic:nvPicPr>
-                    <pic:cNvPr id="1" name=""/>
+                    <pic:cNvPr id="1198291540" name=""/>
                     <pic:cNvPicPr/>
                   </pic:nvPicPr>
                   <pic:blipFill>
@@ -512,7 +582,7 @@
                   <pic:spPr>
                     <a:xfrm>
                       <a:off x="0" y="0"/>
-                      <a:ext cx="5400040" cy="3196590"/>
+                      <a:ext cx="5400040" cy="3004820"/>
                     </a:xfrm>
                     <a:prstGeom prst="rect">
                       <a:avLst/>
@@ -638,6 +708,119 @@
     </w:p>
     <w:p>
       <w:pPr>
+        <w:rPr>
+          <w:rFonts w:ascii="Arial" w:hAnsi="Arial" w:cs="Arial"/>
+          <w:sz w:val="28"/>
+          <w:szCs w:val="28"/>
+        </w:rPr>
+      </w:pPr>
+    </w:p>
+    <w:p>
+      <w:pPr>
+        <w:rPr>
+          <w:rFonts w:ascii="Arial" w:hAnsi="Arial" w:cs="Arial"/>
+          <w:sz w:val="28"/>
+          <w:szCs w:val="28"/>
+        </w:rPr>
+      </w:pPr>
+      <w:r>
+        <w:rPr>
+          <w:rFonts w:ascii="Arial" w:hAnsi="Arial" w:cs="Arial"/>
+          <w:sz w:val="28"/>
+          <w:szCs w:val="28"/>
+        </w:rPr>
+        <w:t>- Infraestrutura Azure</w:t>
+      </w:r>
+    </w:p>
+    <w:p>
+      <w:pPr>
+        <w:rPr>
+          <w:rFonts w:ascii="Arial" w:hAnsi="Arial" w:cs="Arial"/>
+          <w:sz w:val="28"/>
+          <w:szCs w:val="28"/>
+        </w:rPr>
+      </w:pPr>
+      <w:r>
+        <w:rPr>
+          <w:rFonts w:ascii="Arial" w:hAnsi="Arial" w:cs="Arial"/>
+          <w:sz w:val="28"/>
+          <w:szCs w:val="28"/>
+        </w:rPr>
+        <w:drawing>
+          <wp:inline distT="0" distB="0" distL="0" distR="0" wp14:anchorId="41F904BF" wp14:editId="0FD47533">
+            <wp:extent cx="5400040" cy="5942330"/>
+            <wp:effectExtent l="0" t="0" r="0" b="1270"/>
+            <wp:docPr id="1496794859" name="Imagem 1"/>
+            <wp:cNvGraphicFramePr>
+              <a:graphicFrameLocks xmlns:a="http://schemas.openxmlformats.org/drawingml/2006/main" noChangeAspect="1"/>
+            </wp:cNvGraphicFramePr>
+            <a:graphic xmlns:a="http://schemas.openxmlformats.org/drawingml/2006/main">
+              <a:graphicData uri="http://schemas.openxmlformats.org/drawingml/2006/picture">
+                <pic:pic xmlns:pic="http://schemas.openxmlformats.org/drawingml/2006/picture">
+                  <pic:nvPicPr>
+                    <pic:cNvPr id="1496794859" name=""/>
+                    <pic:cNvPicPr/>
+                  </pic:nvPicPr>
+                  <pic:blipFill>
+                    <a:blip r:embed="rId8"/>
+                    <a:stretch>
+                      <a:fillRect/>
+                    </a:stretch>
+                  </pic:blipFill>
+                  <pic:spPr>
+                    <a:xfrm>
+                      <a:off x="0" y="0"/>
+                      <a:ext cx="5400040" cy="5942330"/>
+                    </a:xfrm>
+                    <a:prstGeom prst="rect">
+                      <a:avLst/>
+                    </a:prstGeom>
+                  </pic:spPr>
+                </pic:pic>
+              </a:graphicData>
+            </a:graphic>
+          </wp:inline>
+        </w:drawing>
+      </w:r>
+    </w:p>
+    <w:p>
+      <w:pPr>
+        <w:rPr>
+          <w:rFonts w:ascii="Arial" w:hAnsi="Arial" w:cs="Arial"/>
+          <w:sz w:val="28"/>
+          <w:szCs w:val="28"/>
+        </w:rPr>
+      </w:pPr>
+    </w:p>
+    <w:p>
+      <w:pPr>
+        <w:rPr>
+          <w:rFonts w:ascii="Arial" w:hAnsi="Arial" w:cs="Arial"/>
+          <w:sz w:val="28"/>
+          <w:szCs w:val="28"/>
+        </w:rPr>
+      </w:pPr>
+    </w:p>
+    <w:p>
+      <w:pPr>
+        <w:rPr>
+          <w:rFonts w:ascii="Arial" w:hAnsi="Arial" w:cs="Arial"/>
+          <w:sz w:val="28"/>
+          <w:szCs w:val="28"/>
+        </w:rPr>
+      </w:pPr>
+    </w:p>
+    <w:p>
+      <w:pPr>
+        <w:rPr>
+          <w:rFonts w:ascii="Arial" w:hAnsi="Arial" w:cs="Arial"/>
+          <w:sz w:val="28"/>
+          <w:szCs w:val="28"/>
+        </w:rPr>
+      </w:pPr>
+    </w:p>
+    <w:p>
+      <w:pPr>
         <w:jc w:val="center"/>
         <w:rPr>
           <w:rFonts w:ascii="Arial" w:hAnsi="Arial" w:cs="Arial"/>
@@ -647,7 +830,10 @@
           <w:szCs w:val="36"/>
         </w:rPr>
       </w:pPr>
-      <w:r>
+    </w:p>
+    <w:p>
+      <w:pPr>
+        <w:jc w:val="center"/>
         <w:rPr>
           <w:rFonts w:ascii="Arial" w:hAnsi="Arial" w:cs="Arial"/>
           <w:b/>
@@ -655,7 +841,39 @@
           <w:sz w:val="36"/>
           <w:szCs w:val="36"/>
         </w:rPr>
-        <w:lastRenderedPageBreak/>
+      </w:pPr>
+    </w:p>
+    <w:p>
+      <w:pPr>
+        <w:jc w:val="center"/>
+        <w:rPr>
+          <w:rFonts w:ascii="Arial" w:hAnsi="Arial" w:cs="Arial"/>
+          <w:b/>
+          <w:bCs/>
+          <w:sz w:val="36"/>
+          <w:szCs w:val="36"/>
+        </w:rPr>
+      </w:pPr>
+    </w:p>
+    <w:p>
+      <w:pPr>
+        <w:jc w:val="center"/>
+        <w:rPr>
+          <w:rFonts w:ascii="Arial" w:hAnsi="Arial" w:cs="Arial"/>
+          <w:b/>
+          <w:bCs/>
+          <w:sz w:val="36"/>
+          <w:szCs w:val="36"/>
+        </w:rPr>
+      </w:pPr>
+      <w:r>
+        <w:rPr>
+          <w:rFonts w:ascii="Arial" w:hAnsi="Arial" w:cs="Arial"/>
+          <w:b/>
+          <w:bCs/>
+          <w:sz w:val="36"/>
+          <w:szCs w:val="36"/>
+        </w:rPr>
         <w:t>Link do repositório GitHub</w:t>
       </w:r>
     </w:p>
@@ -676,7 +894,7 @@
           <w:szCs w:val="28"/>
         </w:rPr>
       </w:pPr>
-      <w:hyperlink r:id="rId8" w:history="1">
+      <w:hyperlink r:id="rId9" w:history="1">
         <w:r>
           <w:rPr>
             <w:rStyle w:val="Hyperlink"/>
@@ -747,7 +965,7 @@
       </w:r>
     </w:p>
     <w:sectPr>
-      <w:footerReference w:type="default" r:id="rId9"/>
+      <w:footerReference w:type="default" r:id="rId10"/>
       <w:pgSz w:w="11906" w:h="16838"/>
       <w:pgMar w:top="1417" w:right="1701" w:bottom="1417" w:left="1701" w:header="708" w:footer="708" w:gutter="0"/>
       <w:cols w:space="708"/>
@@ -758,7 +976,7 @@
 </file>
 
 <file path=word/endnotes.xml><?xml version="1.0" encoding="utf-8"?>
-<w:endnotes xmlns:wpc="http://schemas.microsoft.com/office/word/2010/wordprocessingCanvas" xmlns:cx="http://schemas.microsoft.com/office/drawing/2014/chartex" xmlns:cx1="http://schemas.microsoft.com/office/drawing/2015/9/8/chartex" xmlns:cx2="http://schemas.microsoft.com/office/drawing/2015/10/21/chartex" xmlns:cx3="http://schemas.microsoft.com/office/drawing/2016/5/9/chartex" xmlns:cx4="http://schemas.microsoft.com/office/drawing/2016/5/10/chartex" xmlns:cx5="http://schemas.microsoft.com/office/drawing/2016/5/11/chartex" xmlns:cx6="http://schemas.microsoft.com/office/drawing/2016/5/12/chartex" xmlns:cx7="http://schemas.microsoft.com/office/drawing/2016/5/13/chartex" xmlns:cx8="http://schemas.microsoft.com/office/drawing/2016/5/14/chartex" xmlns:mc="http://schemas.openxmlformats.org/markup-compatibility/2006" xmlns:aink="http://schemas.microsoft.com/office/drawing/2016/ink" xmlns:am3d="http://schemas.microsoft.com/office/drawing/2017/model3d" xmlns:o="urn:schemas-microsoft-com:office:office" xmlns:r="http://schemas.openxmlformats.org/officeDocument/2006/relationships" xmlns:m="http://schemas.openxmlformats.org/officeDocument/2006/math" xmlns:v="urn:schemas-microsoft-com:vml" xmlns:wp14="http://schemas.microsoft.com/office/word/2010/wordprocessingDrawing" xmlns:wp="http://schemas.openxmlformats.org/drawingml/2006/wordprocessingDrawing" xmlns:w10="urn:schemas-microsoft-com:office:word" xmlns:w="http://schemas.openxmlformats.org/wordprocessingml/2006/main" xmlns:w14="http://schemas.microsoft.com/office/word/2010/wordml" xmlns:w15="http://schemas.microsoft.com/office/word/2012/wordml" xmlns:w16cex="http://schemas.microsoft.com/office/word/2018/wordml/cex" xmlns:w16cid="http://schemas.microsoft.com/office/word/2016/wordml/cid" xmlns:w16="http://schemas.microsoft.com/office/word/2018/wordml" xmlns:w16sdtdh="http://schemas.microsoft.com/office/word/2020/wordml/sdtdatahash" xmlns:w16se="http://schemas.microsoft.com/office/word/2015/wordml/symex" xmlns:wpg="http://schemas.microsoft.com/office/word/2010/wordprocessingGroup" xmlns:wpi="http://schemas.microsoft.com/office/word/2010/wordprocessingInk" xmlns:wne="http://schemas.microsoft.com/office/word/2006/wordml" xmlns:wps="http://schemas.microsoft.com/office/word/2010/wordprocessingShape" mc:Ignorable="w14 w15 w16se w16cid w16 w16cex w16sdtdh wp14">
+<w:endnotes xmlns:wpc="http://schemas.microsoft.com/office/word/2010/wordprocessingCanvas" xmlns:cx="http://schemas.microsoft.com/office/drawing/2014/chartex" xmlns:cx1="http://schemas.microsoft.com/office/drawing/2015/9/8/chartex" xmlns:cx2="http://schemas.microsoft.com/office/drawing/2015/10/21/chartex" xmlns:cx3="http://schemas.microsoft.com/office/drawing/2016/5/9/chartex" xmlns:cx4="http://schemas.microsoft.com/office/drawing/2016/5/10/chartex" xmlns:cx5="http://schemas.microsoft.com/office/drawing/2016/5/11/chartex" xmlns:cx6="http://schemas.microsoft.com/office/drawing/2016/5/12/chartex" xmlns:cx7="http://schemas.microsoft.com/office/drawing/2016/5/13/chartex" xmlns:cx8="http://schemas.microsoft.com/office/drawing/2016/5/14/chartex" xmlns:mc="http://schemas.openxmlformats.org/markup-compatibility/2006" xmlns:aink="http://schemas.microsoft.com/office/drawing/2016/ink" xmlns:am3d="http://schemas.microsoft.com/office/drawing/2017/model3d" xmlns:o="urn:schemas-microsoft-com:office:office" xmlns:oel="http://schemas.microsoft.com/office/2019/extlst" xmlns:r="http://schemas.openxmlformats.org/officeDocument/2006/relationships" xmlns:m="http://schemas.openxmlformats.org/officeDocument/2006/math" xmlns:v="urn:schemas-microsoft-com:vml" xmlns:wp14="http://schemas.microsoft.com/office/word/2010/wordprocessingDrawing" xmlns:wp="http://schemas.openxmlformats.org/drawingml/2006/wordprocessingDrawing" xmlns:w10="urn:schemas-microsoft-com:office:word" xmlns:w="http://schemas.openxmlformats.org/wordprocessingml/2006/main" xmlns:w14="http://schemas.microsoft.com/office/word/2010/wordml" xmlns:w15="http://schemas.microsoft.com/office/word/2012/wordml" xmlns:w16cex="http://schemas.microsoft.com/office/word/2018/wordml/cex" xmlns:w16cid="http://schemas.microsoft.com/office/word/2016/wordml/cid" xmlns:w16="http://schemas.microsoft.com/office/word/2018/wordml" xmlns:w16du="http://schemas.microsoft.com/office/word/2023/wordml/word16du" xmlns:w16sdtdh="http://schemas.microsoft.com/office/word/2020/wordml/sdtdatahash" xmlns:w16sdtfl="http://schemas.microsoft.com/office/word/2024/wordml/sdtformatlock" xmlns:w16se="http://schemas.microsoft.com/office/word/2015/wordml/symex" xmlns:wpg="http://schemas.microsoft.com/office/word/2010/wordprocessingGroup" xmlns:wpi="http://schemas.microsoft.com/office/word/2010/wordprocessingInk" xmlns:wne="http://schemas.microsoft.com/office/word/2006/wordml" xmlns:wps="http://schemas.microsoft.com/office/word/2010/wordprocessingShape" mc:Ignorable="w14 w15 w16se w16cid w16 w16cex w16sdtdh w16sdtfl w16du wp14">
   <w:endnote w:type="separator" w:id="-1">
     <w:p>
       <w:pPr>
@@ -783,7 +1001,7 @@
 </file>
 
 <file path=word/footer1.xml><?xml version="1.0" encoding="utf-8"?>
-<w:ftr xmlns:wpc="http://schemas.microsoft.com/office/word/2010/wordprocessingCanvas" xmlns:cx="http://schemas.microsoft.com/office/drawing/2014/chartex" xmlns:cx1="http://schemas.microsoft.com/office/drawing/2015/9/8/chartex" xmlns:cx2="http://schemas.microsoft.com/office/drawing/2015/10/21/chartex" xmlns:cx3="http://schemas.microsoft.com/office/drawing/2016/5/9/chartex" xmlns:cx4="http://schemas.microsoft.com/office/drawing/2016/5/10/chartex" xmlns:cx5="http://schemas.microsoft.com/office/drawing/2016/5/11/chartex" xmlns:cx6="http://schemas.microsoft.com/office/drawing/2016/5/12/chartex" xmlns:cx7="http://schemas.microsoft.com/office/drawing/2016/5/13/chartex" xmlns:cx8="http://schemas.microsoft.com/office/drawing/2016/5/14/chartex" xmlns:mc="http://schemas.openxmlformats.org/markup-compatibility/2006" xmlns:aink="http://schemas.microsoft.com/office/drawing/2016/ink" xmlns:am3d="http://schemas.microsoft.com/office/drawing/2017/model3d" xmlns:o="urn:schemas-microsoft-com:office:office" xmlns:r="http://schemas.openxmlformats.org/officeDocument/2006/relationships" xmlns:m="http://schemas.openxmlformats.org/officeDocument/2006/math" xmlns:v="urn:schemas-microsoft-com:vml" xmlns:wp14="http://schemas.microsoft.com/office/word/2010/wordprocessingDrawing" xmlns:wp="http://schemas.openxmlformats.org/drawingml/2006/wordprocessingDrawing" xmlns:w10="urn:schemas-microsoft-com:office:word" xmlns:w="http://schemas.openxmlformats.org/wordprocessingml/2006/main" xmlns:w14="http://schemas.microsoft.com/office/word/2010/wordml" xmlns:w15="http://schemas.microsoft.com/office/word/2012/wordml" xmlns:w16cex="http://schemas.microsoft.com/office/word/2018/wordml/cex" xmlns:w16cid="http://schemas.microsoft.com/office/word/2016/wordml/cid" xmlns:w16="http://schemas.microsoft.com/office/word/2018/wordml" xmlns:w16sdtdh="http://schemas.microsoft.com/office/word/2020/wordml/sdtdatahash" xmlns:w16se="http://schemas.microsoft.com/office/word/2015/wordml/symex" xmlns:wpg="http://schemas.microsoft.com/office/word/2010/wordprocessingGroup" xmlns:wpi="http://schemas.microsoft.com/office/word/2010/wordprocessingInk" xmlns:wne="http://schemas.microsoft.com/office/word/2006/wordml" xmlns:wps="http://schemas.microsoft.com/office/word/2010/wordprocessingShape" mc:Ignorable="w14 w15 w16se w16cid w16 w16cex w16sdtdh wp14">
+<w:ftr xmlns:wpc="http://schemas.microsoft.com/office/word/2010/wordprocessingCanvas" xmlns:cx="http://schemas.microsoft.com/office/drawing/2014/chartex" xmlns:cx1="http://schemas.microsoft.com/office/drawing/2015/9/8/chartex" xmlns:cx2="http://schemas.microsoft.com/office/drawing/2015/10/21/chartex" xmlns:cx3="http://schemas.microsoft.com/office/drawing/2016/5/9/chartex" xmlns:cx4="http://schemas.microsoft.com/office/drawing/2016/5/10/chartex" xmlns:cx5="http://schemas.microsoft.com/office/drawing/2016/5/11/chartex" xmlns:cx6="http://schemas.microsoft.com/office/drawing/2016/5/12/chartex" xmlns:cx7="http://schemas.microsoft.com/office/drawing/2016/5/13/chartex" xmlns:cx8="http://schemas.microsoft.com/office/drawing/2016/5/14/chartex" xmlns:mc="http://schemas.openxmlformats.org/markup-compatibility/2006" xmlns:aink="http://schemas.microsoft.com/office/drawing/2016/ink" xmlns:am3d="http://schemas.microsoft.com/office/drawing/2017/model3d" xmlns:o="urn:schemas-microsoft-com:office:office" xmlns:oel="http://schemas.microsoft.com/office/2019/extlst" xmlns:r="http://schemas.openxmlformats.org/officeDocument/2006/relationships" xmlns:m="http://schemas.openxmlformats.org/officeDocument/2006/math" xmlns:v="urn:schemas-microsoft-com:vml" xmlns:wp14="http://schemas.microsoft.com/office/word/2010/wordprocessingDrawing" xmlns:wp="http://schemas.openxmlformats.org/drawingml/2006/wordprocessingDrawing" xmlns:w10="urn:schemas-microsoft-com:office:word" xmlns:w="http://schemas.openxmlformats.org/wordprocessingml/2006/main" xmlns:w14="http://schemas.microsoft.com/office/word/2010/wordml" xmlns:w15="http://schemas.microsoft.com/office/word/2012/wordml" xmlns:w16cex="http://schemas.microsoft.com/office/word/2018/wordml/cex" xmlns:w16cid="http://schemas.microsoft.com/office/word/2016/wordml/cid" xmlns:w16="http://schemas.microsoft.com/office/word/2018/wordml" xmlns:w16du="http://schemas.microsoft.com/office/word/2023/wordml/word16du" xmlns:w16sdtdh="http://schemas.microsoft.com/office/word/2020/wordml/sdtdatahash" xmlns:w16sdtfl="http://schemas.microsoft.com/office/word/2024/wordml/sdtformatlock" xmlns:w16se="http://schemas.microsoft.com/office/word/2015/wordml/symex" xmlns:wpg="http://schemas.microsoft.com/office/word/2010/wordprocessingGroup" xmlns:wpi="http://schemas.microsoft.com/office/word/2010/wordprocessingInk" xmlns:wne="http://schemas.microsoft.com/office/word/2006/wordml" xmlns:wps="http://schemas.microsoft.com/office/word/2010/wordprocessingShape" mc:Ignorable="w14 w15 w16se w16cid w16 w16cex w16sdtdh w16sdtfl w16du wp14">
   <w:sdt>
     <w:sdtPr>
       <w:id w:val="1650331527"/>
@@ -825,7 +1043,7 @@
 </file>
 
 <file path=word/footnotes.xml><?xml version="1.0" encoding="utf-8"?>
-<w:footnotes xmlns:wpc="http://schemas.microsoft.com/office/word/2010/wordprocessingCanvas" xmlns:cx="http://schemas.microsoft.com/office/drawing/2014/chartex" xmlns:cx1="http://schemas.microsoft.com/office/drawing/2015/9/8/chartex" xmlns:cx2="http://schemas.microsoft.com/office/drawing/2015/10/21/chartex" xmlns:cx3="http://schemas.microsoft.com/office/drawing/2016/5/9/chartex" xmlns:cx4="http://schemas.microsoft.com/office/drawing/2016/5/10/chartex" xmlns:cx5="http://schemas.microsoft.com/office/drawing/2016/5/11/chartex" xmlns:cx6="http://schemas.microsoft.com/office/drawing/2016/5/12/chartex" xmlns:cx7="http://schemas.microsoft.com/office/drawing/2016/5/13/chartex" xmlns:cx8="http://schemas.microsoft.com/office/drawing/2016/5/14/chartex" xmlns:mc="http://schemas.openxmlformats.org/markup-compatibility/2006" xmlns:aink="http://schemas.microsoft.com/office/drawing/2016/ink" xmlns:am3d="http://schemas.microsoft.com/office/drawing/2017/model3d" xmlns:o="urn:schemas-microsoft-com:office:office" xmlns:r="http://schemas.openxmlformats.org/officeDocument/2006/relationships" xmlns:m="http://schemas.openxmlformats.org/officeDocument/2006/math" xmlns:v="urn:schemas-microsoft-com:vml" xmlns:wp14="http://schemas.microsoft.com/office/word/2010/wordprocessingDrawing" xmlns:wp="http://schemas.openxmlformats.org/drawingml/2006/wordprocessingDrawing" xmlns:w10="urn:schemas-microsoft-com:office:word" xmlns:w="http://schemas.openxmlformats.org/wordprocessingml/2006/main" xmlns:w14="http://schemas.microsoft.com/office/word/2010/wordml" xmlns:w15="http://schemas.microsoft.com/office/word/2012/wordml" xmlns:w16cex="http://schemas.microsoft.com/office/word/2018/wordml/cex" xmlns:w16cid="http://schemas.microsoft.com/office/word/2016/wordml/cid" xmlns:w16="http://schemas.microsoft.com/office/word/2018/wordml" xmlns:w16sdtdh="http://schemas.microsoft.com/office/word/2020/wordml/sdtdatahash" xmlns:w16se="http://schemas.microsoft.com/office/word/2015/wordml/symex" xmlns:wpg="http://schemas.microsoft.com/office/word/2010/wordprocessingGroup" xmlns:wpi="http://schemas.microsoft.com/office/word/2010/wordprocessingInk" xmlns:wne="http://schemas.microsoft.com/office/word/2006/wordml" xmlns:wps="http://schemas.microsoft.com/office/word/2010/wordprocessingShape" mc:Ignorable="w14 w15 w16se w16cid w16 w16cex w16sdtdh wp14">
+<w:footnotes xmlns:wpc="http://schemas.microsoft.com/office/word/2010/wordprocessingCanvas" xmlns:cx="http://schemas.microsoft.com/office/drawing/2014/chartex" xmlns:cx1="http://schemas.microsoft.com/office/drawing/2015/9/8/chartex" xmlns:cx2="http://schemas.microsoft.com/office/drawing/2015/10/21/chartex" xmlns:cx3="http://schemas.microsoft.com/office/drawing/2016/5/9/chartex" xmlns:cx4="http://schemas.microsoft.com/office/drawing/2016/5/10/chartex" xmlns:cx5="http://schemas.microsoft.com/office/drawing/2016/5/11/chartex" xmlns:cx6="http://schemas.microsoft.com/office/drawing/2016/5/12/chartex" xmlns:cx7="http://schemas.microsoft.com/office/drawing/2016/5/13/chartex" xmlns:cx8="http://schemas.microsoft.com/office/drawing/2016/5/14/chartex" xmlns:mc="http://schemas.openxmlformats.org/markup-compatibility/2006" xmlns:aink="http://schemas.microsoft.com/office/drawing/2016/ink" xmlns:am3d="http://schemas.microsoft.com/office/drawing/2017/model3d" xmlns:o="urn:schemas-microsoft-com:office:office" xmlns:oel="http://schemas.microsoft.com/office/2019/extlst" xmlns:r="http://schemas.openxmlformats.org/officeDocument/2006/relationships" xmlns:m="http://schemas.openxmlformats.org/officeDocument/2006/math" xmlns:v="urn:schemas-microsoft-com:vml" xmlns:wp14="http://schemas.microsoft.com/office/word/2010/wordprocessingDrawing" xmlns:wp="http://schemas.openxmlformats.org/drawingml/2006/wordprocessingDrawing" xmlns:w10="urn:schemas-microsoft-com:office:word" xmlns:w="http://schemas.openxmlformats.org/wordprocessingml/2006/main" xmlns:w14="http://schemas.microsoft.com/office/word/2010/wordml" xmlns:w15="http://schemas.microsoft.com/office/word/2012/wordml" xmlns:w16cex="http://schemas.microsoft.com/office/word/2018/wordml/cex" xmlns:w16cid="http://schemas.microsoft.com/office/word/2016/wordml/cid" xmlns:w16="http://schemas.microsoft.com/office/word/2018/wordml" xmlns:w16du="http://schemas.microsoft.com/office/word/2023/wordml/word16du" xmlns:w16sdtdh="http://schemas.microsoft.com/office/word/2020/wordml/sdtdatahash" xmlns:w16sdtfl="http://schemas.microsoft.com/office/word/2024/wordml/sdtformatlock" xmlns:w16se="http://schemas.microsoft.com/office/word/2015/wordml/symex" xmlns:wpg="http://schemas.microsoft.com/office/word/2010/wordprocessingGroup" xmlns:wpi="http://schemas.microsoft.com/office/word/2010/wordprocessingInk" xmlns:wne="http://schemas.microsoft.com/office/word/2006/wordml" xmlns:wps="http://schemas.microsoft.com/office/word/2010/wordprocessingShape" mc:Ignorable="w14 w15 w16se w16cid w16 w16cex w16sdtdh w16sdtfl w16du wp14">
   <w:footnote w:type="separator" w:id="-1">
     <w:p>
       <w:pPr>
@@ -850,7 +1068,7 @@
 </file>
 
 <file path=word/styles.xml><?xml version="1.0" encoding="utf-8"?>
-<w:styles xmlns:mc="http://schemas.openxmlformats.org/markup-compatibility/2006" xmlns:r="http://schemas.openxmlformats.org/officeDocument/2006/relationships" xmlns:w="http://schemas.openxmlformats.org/wordprocessingml/2006/main" xmlns:w14="http://schemas.microsoft.com/office/word/2010/wordml" xmlns:w15="http://schemas.microsoft.com/office/word/2012/wordml" xmlns:w16cex="http://schemas.microsoft.com/office/word/2018/wordml/cex" xmlns:w16cid="http://schemas.microsoft.com/office/word/2016/wordml/cid" xmlns:w16="http://schemas.microsoft.com/office/word/2018/wordml" xmlns:w16sdtdh="http://schemas.microsoft.com/office/word/2020/wordml/sdtdatahash" xmlns:w16se="http://schemas.microsoft.com/office/word/2015/wordml/symex" mc:Ignorable="w14 w15 w16se w16cid w16 w16cex w16sdtdh">
+<w:styles xmlns:mc="http://schemas.openxmlformats.org/markup-compatibility/2006" xmlns:r="http://schemas.openxmlformats.org/officeDocument/2006/relationships" xmlns:w="http://schemas.openxmlformats.org/wordprocessingml/2006/main" xmlns:w14="http://schemas.microsoft.com/office/word/2010/wordml" xmlns:w15="http://schemas.microsoft.com/office/word/2012/wordml" xmlns:w16cex="http://schemas.microsoft.com/office/word/2018/wordml/cex" xmlns:w16cid="http://schemas.microsoft.com/office/word/2016/wordml/cid" xmlns:w16="http://schemas.microsoft.com/office/word/2018/wordml" xmlns:w16du="http://schemas.microsoft.com/office/word/2023/wordml/word16du" xmlns:w16sdtdh="http://schemas.microsoft.com/office/word/2020/wordml/sdtdatahash" xmlns:w16sdtfl="http://schemas.microsoft.com/office/word/2024/wordml/sdtformatlock" xmlns:w16se="http://schemas.microsoft.com/office/word/2015/wordml/symex" mc:Ignorable="w14 w15 w16se w16cid w16 w16cex w16sdtdh w16sdtfl w16du">
   <w:docDefaults>
     <w:rPrDefault>
       <w:rPr>

</xml_diff>